<commit_message>
auto(daily): dev loop report 2026-06-06
</commit_message>
<xml_diff>
--- a/reports/hypothesis/2026-06-06.docx
+++ b/reports/hypothesis/2026-06-06.docx
@@ -15,7 +15,7 @@
         <w:rPr>
           <w:i/>
         </w:rPr>
-        <w:t>생성일: 2026-06-06 09:15 KST  |  표본: 측정소당 최소 2292건 / 총 11635건</w:t>
+        <w:t>생성일: 2026-06-06 13:18 KST  |  표본: 측정소당 최소 2297건 / 총 11660건</w:t>
       </w:r>
     </w:p>
     <w:p>
@@ -143,7 +143,7 @@
           </w:tcPr>
           <w:p>
             <w:r>
-              <w:t>37.831</w:t>
+              <w:t>37.809</w:t>
             </w:r>
           </w:p>
         </w:tc>
@@ -153,7 +153,7 @@
           </w:tcPr>
           <w:p>
             <w:r>
-              <w:t>34.318</w:t>
+              <w:t>34.596</w:t>
             </w:r>
           </w:p>
         </w:tc>
@@ -163,7 +163,7 @@
           </w:tcPr>
           <w:p>
             <w:r>
-              <w:t>+3.513</w:t>
+              <w:t>+3.214</w:t>
             </w:r>
           </w:p>
         </w:tc>
@@ -193,7 +193,7 @@
           </w:tcPr>
           <w:p>
             <w:r>
-              <w:t>+0.15 (미미함)</w:t>
+              <w:t>+0.14 (미미함)</w:t>
             </w:r>
           </w:p>
         </w:tc>
@@ -215,7 +215,7 @@
           </w:tcPr>
           <w:p>
             <w:r>
-              <w:t>21.090</w:t>
+              <w:t>21.076</w:t>
             </w:r>
           </w:p>
         </w:tc>
@@ -225,7 +225,7 @@
           </w:tcPr>
           <w:p>
             <w:r>
-              <w:t>17.777</w:t>
+              <w:t>17.773</w:t>
             </w:r>
           </w:p>
         </w:tc>
@@ -235,7 +235,7 @@
           </w:tcPr>
           <w:p>
             <w:r>
-              <w:t>+3.314</w:t>
+              <w:t>+3.302</w:t>
             </w:r>
           </w:p>
         </w:tc>
@@ -553,7 +553,7 @@
           </w:tcPr>
           <w:p>
             <w:r>
-              <w:t>-0.48 (작음)</w:t>
+              <w:t>-0.47 (작음)</w:t>
             </w:r>
           </w:p>
         </w:tc>
@@ -660,7 +660,7 @@
           </w:tcPr>
           <w:p>
             <w:r>
-              <w:t>35.02</w:t>
+              <w:t>32.09</w:t>
             </w:r>
           </w:p>
         </w:tc>
@@ -690,7 +690,7 @@
           </w:tcPr>
           <w:p>
             <w:r>
-              <w:t>0.012</w:t>
+              <w:t>0.011</w:t>
             </w:r>
           </w:p>
         </w:tc>
@@ -784,7 +784,7 @@
           </w:tcPr>
           <w:p>
             <w:r>
-              <w:t>13.49</w:t>
+              <w:t>13.11</w:t>
             </w:r>
           </w:p>
         </w:tc>
@@ -846,7 +846,7 @@
           </w:tcPr>
           <w:p>
             <w:r>
-              <w:t>149.29</w:t>
+              <w:t>149.64</w:t>
             </w:r>
           </w:p>
         </w:tc>
@@ -908,7 +908,7 @@
           </w:tcPr>
           <w:p>
             <w:r>
-              <w:t>70.25</w:t>
+              <w:t>70.12</w:t>
             </w:r>
           </w:p>
         </w:tc>
@@ -970,7 +970,7 @@
           </w:tcPr>
           <w:p>
             <w:r>
-              <w:t>151.53</w:t>
+              <w:t>151.07</w:t>
             </w:r>
           </w:p>
         </w:tc>
@@ -1029,7 +1029,7 @@
         <w:pStyle w:val="ListBullet"/>
       </w:pPr>
       <w:r>
-        <w:t>'산단 영향군'가 '베이스라인'보다 평균 3.31 높음 (p=0.0000, 효과크기 작음 d=0.25).</w:t>
+        <w:t>'산단 영향군'가 '베이스라인'보다 평균 3.30 높음 (p=0.0000, 효과크기 작음 d=0.25).</w:t>
       </w:r>
     </w:p>
     <w:p>

</xml_diff>